<commit_message>
20260424 - commit pentru 20260423
</commit_message>
<xml_diff>
--- a/Lucrare_licenta.docx
+++ b/Lucrare_licenta.docx
@@ -791,21 +791,7 @@
                 <w:rStyle w:val="Hyperlink"/>
                 <w:lang w:val="ro-RO"/>
               </w:rPr>
-              <w:t>Surs</w:t>
-            </w:r>
-            <w:r>
-              <w:rPr>
-                <w:rStyle w:val="Hyperlink"/>
-                <w:lang w:val="ro-RO"/>
-              </w:rPr>
-              <w:t>a</w:t>
-            </w:r>
-            <w:r>
-              <w:rPr>
-                <w:rStyle w:val="Hyperlink"/>
-                <w:lang w:val="ro-RO"/>
-              </w:rPr>
-              <w:t xml:space="preserve"> de date</w:t>
+              <w:t>Sursa de date</w:t>
             </w:r>
             <w:r>
               <w:rPr>
@@ -1636,11 +1622,7 @@
         <w:ind w:firstLine="720"/>
       </w:pPr>
       <w:r>
-        <w:rPr>
-          <w:rFonts w:eastAsia="Times New Roman" w:cs="Times New Roman"/>
-          <w:highlight w:val="yellow"/>
-        </w:rPr>
-        <w:t>Analiza pieței muncii europene în perioada 2015–prezent reprezintă o temă de actualitate deosebită, marcată de transformări structurale profunde generate de digitalizare, pandemia de COVID-19, migrația forței de muncă și emergența noilor forme de angajare. Înțelegerea acestor fenomene complexe necesită o abordare multidimensională, care să integreze perspective economice, sociale, politice și tehnologice. Prezenta recenzie a literaturii de specialitate urmărește să sintetizeze principalele contribuții teoretice și empirice relevante pentru tema cercetării, identificând totodată tendințele dominante și lacunele existente în literatura de profil.</w:t>
+        <w:t>Piața muncii europeană a trecut prin schimbări foarte importante în ultimii ani, mai ales începând cu 2015. Printre cele mai relevante fenomene se numără digitalizarea accelerată, criza provocată de pandemia COVID-19, migrația forței de muncă și apariția unor noi forme de angajare, cum ar fi munca freelance sau platformele digitale. Toate acestea au transformat profund modul în care funcționează piețele muncii din Europa. Pentru a înțelege aceste schimbări, este necesar să le privim din mai multe perspective – economică, socială, politică și tehnologică. În această recenzie a literaturii de specialitate, mi-am propus să creez o imagine de ansamblu asupra principalelor contribuții teoretice și empirice legate de această temă și să trag câteva concluzii relevante despre evoluția pieței muncii europene în această perioadă.</w:t>
       </w:r>
     </w:p>
     <w:p>
@@ -1698,14 +1680,14 @@
         <w:rPr>
           <w:rFonts w:eastAsia="Times New Roman" w:cs="Times New Roman"/>
         </w:rPr>
-        <w:t xml:space="preserve"> et al. (2017) adaugă la literatura de specialitate un studiu la scară europeană al economiei gig, economie ce presupune contracte temporare și muncă ocazională. Cercetarea are la bază sondaje aplicate unui eșantion de peste 17.000 de lucrători din șapte țări europene, din care rezultă faptul că o proporție mare din populația </w:t>
+        <w:t xml:space="preserve"> et al. (2017) adaugă la literatura de specialitate un studiu la scară europeană al economiei gig, economie ce presupune contracte </w:t>
       </w:r>
       <w:r>
         <w:rPr>
           <w:rFonts w:eastAsia="Times New Roman" w:cs="Times New Roman"/>
         </w:rPr>
         <w:lastRenderedPageBreak/>
-        <w:t>activă — conform sondajului, 9% în Regatul Unit și 22% în Italia — a optat pentru munca prin platforme digitale, aproximativ 13% considerându-se lucrători independenți. Autorii evidențiază faptul că acest sistem este încă fragil din punct de vedere structural, mulți lucrători raportând că au întâmpinat perioade lungi de așteptare și rezilieri arbitrare ale contractelor, ilustrând riscurile la care se expun cei care recurg la această formă de muncă pentru a-și asigura traiul.</w:t>
+        <w:t>temporare și muncă ocazională. Cercetarea are la bază sondaje aplicate unui eșantion de peste 17.000 de lucrători din șapte țări europene, din care rezultă faptul că o proporție mare din populația activă — conform sondajului, 9% în Regatul Unit și 22% în Italia — a optat pentru munca prin platforme digitale, aproximativ 13% considerându-se lucrători independenți. Autorii evidențiază faptul că acest sistem este încă fragil din punct de vedere structural, mulți lucrători raportând că au întâmpinat perioade lungi de așteptare și rezilieri arbitrare ale contractelor, ilustrând riscurile la care se expun cei care recurg la această formă de muncă pentru a-și asigura traiul.</w:t>
       </w:r>
     </w:p>
     <w:p>
@@ -1716,21 +1698,7 @@
         <w:rPr>
           <w:rFonts w:eastAsia="Times New Roman" w:cs="Times New Roman"/>
         </w:rPr>
-        <w:t xml:space="preserve">Analizând problema migrației din perspectivă regională, </w:t>
-      </w:r>
-      <w:proofErr w:type="spellStart"/>
-      <w:r>
-        <w:rPr>
-          <w:rFonts w:eastAsia="Times New Roman" w:cs="Times New Roman"/>
-        </w:rPr>
-        <w:t>Tirca</w:t>
-      </w:r>
-      <w:proofErr w:type="spellEnd"/>
-      <w:r>
-        <w:rPr>
-          <w:rFonts w:eastAsia="Times New Roman" w:cs="Times New Roman"/>
-        </w:rPr>
-        <w:t xml:space="preserve"> și Bujor (2024) subliniază faptul că politicile de migrație ale statelor din Uniunea Europeană au influențat semnificativ numărul de persoane care își schimbă locul de trai pentru a munci, predominant fiind fluxul dintre Europa Centrală și de Est și Europa de Vest. Noile fluxuri de emigrare, împreună cu politicile restrictive temporare din țările gazdă și condițiile economice din țările de origine, au modelat în mod direct volumul și direcțiile migrației.</w:t>
+        <w:t>Analizând problema migrației din perspectivă regională, Tirca și Bujor (2024) subliniază faptul că politicile de migrație ale statelor din Uniunea Europeană au influențat semnificativ numărul de persoane care își schimbă locul de trai pentru a munci, predominant fiind fluxul dintre Europa Centrală și de Est și Europa de Vest. Noile fluxuri de emigrare, împreună cu politicile restrictive temporare din țările gazdă și condițiile economice din țările de origine, au modelat în mod direct volumul și direcțiile migrației.</w:t>
       </w:r>
     </w:p>
     <w:p>
@@ -1819,7 +1787,14 @@
         <w:rPr>
           <w:rFonts w:eastAsia="Times New Roman" w:cs="Times New Roman"/>
         </w:rPr>
-        <w:t xml:space="preserve"> (2022) ridică totodată întrebarea dacă au existat fenomene discriminatorii pe piața muncii în perioada pandemică, respectiv dacă grupurile vulnerabile — femei, tineri, vârstnici și persoane cu nivel scăzut de educație — și-au pierdut locurile de muncă mai frecvent decât restul populației active. Analiza sugerează că, deși dezechilibrele nu au atins amploarea crizei anterioare, efectele distributive au fost inegale, afectând disproporționat anumite categorii de lucrători.</w:t>
+        <w:t xml:space="preserve"> (2022) ridică totodată întrebarea dacă au existat fenomene discriminatorii pe piața muncii în perioada pandemică, respectiv dacă grupurile vulnerabile — femei, tineri, vârstnici și persoane cu nivel scăzut de educație — și-au pierdut locurile de muncă mai frecvent decât restul populației active. Analiza sugerează că, deși dezechilibrele nu au atins </w:t>
+      </w:r>
+      <w:r>
+        <w:rPr>
+          <w:rFonts w:eastAsia="Times New Roman" w:cs="Times New Roman"/>
+        </w:rPr>
+        <w:lastRenderedPageBreak/>
+        <w:t>amploarea crizei anterioare, efectele distributive au fost inegale, afectând disproporționat anumite categorii de lucrători.</w:t>
       </w:r>
     </w:p>
     <w:p>
@@ -1830,78 +1805,142 @@
         <w:rPr>
           <w:rFonts w:eastAsia="Times New Roman" w:cs="Times New Roman"/>
         </w:rPr>
+        <w:t xml:space="preserve">Dintr-o perspectivă complementară, Szigeti, </w:t>
+      </w:r>
+      <w:proofErr w:type="spellStart"/>
+      <w:r>
+        <w:rPr>
+          <w:rFonts w:eastAsia="Times New Roman" w:cs="Times New Roman"/>
+        </w:rPr>
+        <w:t>Pásztóová</w:t>
+      </w:r>
+      <w:proofErr w:type="spellEnd"/>
+      <w:r>
+        <w:rPr>
+          <w:rFonts w:eastAsia="Times New Roman" w:cs="Times New Roman"/>
+        </w:rPr>
+        <w:t xml:space="preserve"> și </w:t>
+      </w:r>
+      <w:proofErr w:type="spellStart"/>
+      <w:r>
+        <w:rPr>
+          <w:rFonts w:eastAsia="Times New Roman" w:cs="Times New Roman"/>
+        </w:rPr>
+        <w:t>Mezősi</w:t>
+      </w:r>
+      <w:proofErr w:type="spellEnd"/>
+      <w:r>
+        <w:rPr>
+          <w:rFonts w:eastAsia="Times New Roman" w:cs="Times New Roman"/>
+        </w:rPr>
+        <w:t xml:space="preserve"> (2023) investighează impactul COVID-19 asupra forței de muncă prin prisma consecințelor asupra sănătății și calității vieții. Pe baza unui sondaj cantitativ aplicat în mai–iunie 2022 unui eșantion de 110 pacienți </w:t>
+      </w:r>
+      <w:proofErr w:type="spellStart"/>
+      <w:r>
+        <w:rPr>
+          <w:rFonts w:eastAsia="Times New Roman" w:cs="Times New Roman"/>
+        </w:rPr>
+        <w:t>post-COVID</w:t>
+      </w:r>
+      <w:proofErr w:type="spellEnd"/>
+      <w:r>
+        <w:rPr>
+          <w:rFonts w:eastAsia="Times New Roman" w:cs="Times New Roman"/>
+        </w:rPr>
+        <w:t xml:space="preserve"> din 12 țări europene, autorii demonstrează că simptomele </w:t>
+      </w:r>
+      <w:proofErr w:type="spellStart"/>
+      <w:r>
+        <w:rPr>
+          <w:rFonts w:eastAsia="Times New Roman" w:cs="Times New Roman"/>
+        </w:rPr>
+        <w:t>post-COVID</w:t>
+      </w:r>
+      <w:proofErr w:type="spellEnd"/>
+      <w:r>
+        <w:rPr>
+          <w:rFonts w:eastAsia="Times New Roman" w:cs="Times New Roman"/>
+        </w:rPr>
+        <w:t xml:space="preserve"> și </w:t>
+      </w:r>
+      <w:proofErr w:type="spellStart"/>
+      <w:r>
+        <w:rPr>
+          <w:rFonts w:eastAsia="Times New Roman" w:cs="Times New Roman"/>
+        </w:rPr>
+        <w:t>long</w:t>
+      </w:r>
+      <w:proofErr w:type="spellEnd"/>
+      <w:r>
+        <w:rPr>
+          <w:rFonts w:eastAsia="Times New Roman" w:cs="Times New Roman"/>
+        </w:rPr>
+        <w:t>-COVID au afectat cu precădere activitățile sociale și performanța profesională. Concluzia centrală a studiului este că activitatea profesională desfășurată în timpul bolii a avut un impact semnificativ asupra calității vieții, mobilității și capacității de muncă a angajaților, evidențiind astfel costurile umane ale pandemiei, adesea neglijate în analizele macroeconomice.</w:t>
+      </w:r>
+    </w:p>
+    <w:p>
+      <w:pPr>
+        <w:ind w:firstLine="720"/>
+      </w:pPr>
+      <w:r>
+        <w:rPr>
+          <w:rFonts w:eastAsia="Times New Roman" w:cs="Times New Roman"/>
+        </w:rPr>
+        <w:t>Din perspectiva mobilității economice, Tirca și Bujor (2024) documentează că remitențele reprezentau 4,4% din PIB-ul României în 2009, iar între 2005 și 2010 românii aflați la muncă în străinătate au trimis acasă aproximativ 38,8 miliarde de dolari. Autorii atrag atenția că exodul de capital uman din țările de origine poate prejudicia grav aceste economii prin crearea unui deficit de forță de muncă, reducând rezerva de talente necesară pentru dezvoltare economică sustenabilă.</w:t>
+      </w:r>
+    </w:p>
+    <w:p>
+      <w:pPr>
+        <w:ind w:firstLine="720"/>
+      </w:pPr>
+      <w:r>
+        <w:rPr>
+          <w:rFonts w:eastAsia="Times New Roman" w:cs="Times New Roman"/>
+        </w:rPr>
+        <w:t>Dimensiunea socială a transformărilor pieței muncii europene se manifestă cu precădere prin schimbările în structura ocupațională, în cerințele de competențe și în sistemele de formare profesională. Caterino et al. (2025) subliniază că, în era Industriei 5.0, formarea forței de muncă devine esențială pentru succesul întreprinderilor de producție, asigurând menținerea productivității și a avantajelor competitive. Studiul identifică o distincție fundamentală între sarcinile repetitive — unde curba de învățare este bine documentată — și sarcinile non-repetitive, care implică un proces accentuat de uitare și necesită strategii de formare adaptate, integrate cu tehnologii emergente precum Realitatea Virtuală și Augmentată.</w:t>
+      </w:r>
+    </w:p>
+    <w:p>
+      <w:pPr>
+        <w:ind w:firstLine="720"/>
+      </w:pPr>
+      <w:r>
+        <w:rPr>
+          <w:rFonts w:eastAsia="Times New Roman" w:cs="Times New Roman"/>
+        </w:rPr>
+        <w:t>Autorii propun un cadru preliminar de formare care definește momentul optim pentru sesiunile de training pe baza scăderii performanței operatorilor, măsurată prin indicatori-cheie de performanță precum calitatea produsului, timpul de execuție, numărul de erori și incidentele de siguranță. Caterino et al. (2025) atrag atenția că există o lipsă semnificativă de studii care să evalueze efectele economice ale programelor de formare din perspectiva managementului — un aspect ce rămâne o direcție importantă de cercetare viitoare.</w:t>
+      </w:r>
+    </w:p>
+    <w:p>
+      <w:pPr>
+        <w:ind w:firstLine="720"/>
+      </w:pPr>
+      <w:r>
+        <w:rPr>
+          <w:rFonts w:eastAsia="Times New Roman" w:cs="Times New Roman"/>
+        </w:rPr>
+        <w:t xml:space="preserve">Complementar, Varga și </w:t>
+      </w:r>
+      <w:proofErr w:type="spellStart"/>
+      <w:r>
+        <w:rPr>
+          <w:rFonts w:eastAsia="Times New Roman" w:cs="Times New Roman"/>
+        </w:rPr>
+        <w:t>Sági</w:t>
+      </w:r>
+      <w:proofErr w:type="spellEnd"/>
+      <w:r>
+        <w:rPr>
+          <w:rFonts w:eastAsia="Times New Roman" w:cs="Times New Roman"/>
+        </w:rPr>
+        <w:t xml:space="preserve"> (2024) analizează sistemele de învățământ superior dual din Uniunea Europeană, argumentând că integrarea experienței practice în parcursul academic reprezintă un răspuns structural la cerințele pieței muncii. Studiul documentează că, deși Germania și Austria funcționează ca modele de referință pentru sisteme bine structurate de educație duală, </w:t>
+      </w:r>
+      <w:r>
+        <w:rPr>
+          <w:rFonts w:eastAsia="Times New Roman" w:cs="Times New Roman"/>
+        </w:rPr>
         <w:lastRenderedPageBreak/>
-        <w:t xml:space="preserve">Dintr-o perspectivă complementară, Szigeti, </w:t>
-      </w:r>
-      <w:proofErr w:type="spellStart"/>
-      <w:r>
-        <w:rPr>
-          <w:rFonts w:eastAsia="Times New Roman" w:cs="Times New Roman"/>
-        </w:rPr>
-        <w:t>Pásztóová</w:t>
-      </w:r>
-      <w:proofErr w:type="spellEnd"/>
-      <w:r>
-        <w:rPr>
-          <w:rFonts w:eastAsia="Times New Roman" w:cs="Times New Roman"/>
-        </w:rPr>
-        <w:t xml:space="preserve"> și </w:t>
-      </w:r>
-      <w:proofErr w:type="spellStart"/>
-      <w:r>
-        <w:rPr>
-          <w:rFonts w:eastAsia="Times New Roman" w:cs="Times New Roman"/>
-        </w:rPr>
-        <w:t>Mezősi</w:t>
-      </w:r>
-      <w:proofErr w:type="spellEnd"/>
-      <w:r>
-        <w:rPr>
-          <w:rFonts w:eastAsia="Times New Roman" w:cs="Times New Roman"/>
-        </w:rPr>
-        <w:t xml:space="preserve"> (2023) investighează impactul COVID-19 asupra forței de muncă prin prisma consecințelor asupra sănătății și calității vieții. Pe baza unui sondaj cantitativ aplicat în mai–iunie 2022 unui eșantion de 110 pacienți </w:t>
-      </w:r>
-      <w:proofErr w:type="spellStart"/>
-      <w:r>
-        <w:rPr>
-          <w:rFonts w:eastAsia="Times New Roman" w:cs="Times New Roman"/>
-        </w:rPr>
-        <w:t>post-COVID</w:t>
-      </w:r>
-      <w:proofErr w:type="spellEnd"/>
-      <w:r>
-        <w:rPr>
-          <w:rFonts w:eastAsia="Times New Roman" w:cs="Times New Roman"/>
-        </w:rPr>
-        <w:t xml:space="preserve"> din 12 țări europene, autorii demonstrează că simptomele </w:t>
-      </w:r>
-      <w:proofErr w:type="spellStart"/>
-      <w:r>
-        <w:rPr>
-          <w:rFonts w:eastAsia="Times New Roman" w:cs="Times New Roman"/>
-        </w:rPr>
-        <w:t>post-COVID</w:t>
-      </w:r>
-      <w:proofErr w:type="spellEnd"/>
-      <w:r>
-        <w:rPr>
-          <w:rFonts w:eastAsia="Times New Roman" w:cs="Times New Roman"/>
-        </w:rPr>
-        <w:t xml:space="preserve"> și </w:t>
-      </w:r>
-      <w:proofErr w:type="spellStart"/>
-      <w:r>
-        <w:rPr>
-          <w:rFonts w:eastAsia="Times New Roman" w:cs="Times New Roman"/>
-        </w:rPr>
-        <w:t>long</w:t>
-      </w:r>
-      <w:proofErr w:type="spellEnd"/>
-      <w:r>
-        <w:rPr>
-          <w:rFonts w:eastAsia="Times New Roman" w:cs="Times New Roman"/>
-        </w:rPr>
-        <w:t>-COVID au afectat cu precădere activitățile sociale și performanța profesională. Concluzia centrală a studiului este că activitatea profesională desfășurată în timpul bolii a avut un impact semnificativ asupra calității vieții, mobilității și capacității de muncă a angajaților, evidențiind astfel costurile umane ale pandemiei, adesea neglijate în analizele macroeconomice.</w:t>
+        <w:t>alte state membre — inclusiv România, unde Ministerul Educației a lansat în 2023 un Plan Național care prevede crearea de campusuri vocaționale integrate — se află în diverse stadii de implementare. Autorii evidențiază că programele de educație duală contribuie la reducerea decalajului dintre calificările absolvenților și cerințele angajatorilor, facilitând tranziția de la educație la ocupare.</w:t>
       </w:r>
     </w:p>
     <w:p>
@@ -1912,21 +1951,73 @@
         <w:rPr>
           <w:rFonts w:eastAsia="Times New Roman" w:cs="Times New Roman"/>
         </w:rPr>
-        <w:t xml:space="preserve">Din perspectiva mobilității economice, </w:t>
-      </w:r>
-      <w:proofErr w:type="spellStart"/>
-      <w:r>
-        <w:rPr>
-          <w:rFonts w:eastAsia="Times New Roman" w:cs="Times New Roman"/>
-        </w:rPr>
-        <w:t>Tirca</w:t>
-      </w:r>
-      <w:proofErr w:type="spellEnd"/>
-      <w:r>
-        <w:rPr>
-          <w:rFonts w:eastAsia="Times New Roman" w:cs="Times New Roman"/>
-        </w:rPr>
-        <w:t xml:space="preserve"> și Bujor (2024) documentează că remitențele reprezentau 4,4% din PIB-ul României în 2009, iar între 2005 și 2010 românii aflați la muncă în străinătate au trimis acasă aproximativ 38,8 miliarde de dolari. Autorii atrag atenția că exodul de capital uman din țările de origine poate prejudicia grav aceste economii prin crearea unui deficit de forță de muncă, reducând rezerva de talente necesară pentru dezvoltare economică sustenabilă.</w:t>
+        <w:t xml:space="preserve">Mobilitatea forței de muncă </w:t>
+      </w:r>
+      <w:r>
+        <w:rPr>
+          <w:rFonts w:eastAsia="Times New Roman" w:cs="Times New Roman"/>
+        </w:rPr>
+        <w:t xml:space="preserve">de tip </w:t>
+      </w:r>
+      <w:r>
+        <w:rPr>
+          <w:rFonts w:eastAsia="Times New Roman" w:cs="Times New Roman"/>
+        </w:rPr>
+        <w:t>calificat</w:t>
+      </w:r>
+      <w:r>
+        <w:rPr>
+          <w:rFonts w:eastAsia="Times New Roman" w:cs="Times New Roman"/>
+        </w:rPr>
+        <w:t xml:space="preserve"> </w:t>
+      </w:r>
+      <w:r>
+        <w:rPr>
+          <w:rFonts w:eastAsia="Times New Roman" w:cs="Times New Roman"/>
+        </w:rPr>
+        <w:t xml:space="preserve">reprezintă o altă dimensiune cu implicații profunde. </w:t>
+      </w:r>
+      <w:proofErr w:type="spellStart"/>
+      <w:r>
+        <w:rPr>
+          <w:rFonts w:eastAsia="Times New Roman" w:cs="Times New Roman"/>
+        </w:rPr>
+        <w:t>Beckers</w:t>
+      </w:r>
+      <w:proofErr w:type="spellEnd"/>
+      <w:r>
+        <w:rPr>
+          <w:rFonts w:eastAsia="Times New Roman" w:cs="Times New Roman"/>
+        </w:rPr>
+        <w:t xml:space="preserve"> et al. (2024) demonstrează că emigrarea din Balcanii de Vest a exacerbat deficitele de forță de muncă și de competențe la nivelul tuturor ocupațiunilor din regiune. Paradoxal, cercetarea arată că emigrarea netă din regiune se produce în principal în rândul persoanelor cu nivel mediu și scăzut de educație, contrazicând focalizarea exclusivă pe fenomenul </w:t>
+      </w:r>
+      <w:proofErr w:type="spellStart"/>
+      <w:r>
+        <w:rPr>
+          <w:rFonts w:eastAsia="Times New Roman" w:cs="Times New Roman"/>
+        </w:rPr>
+        <w:t>brain</w:t>
+      </w:r>
+      <w:proofErr w:type="spellEnd"/>
+      <w:r>
+        <w:rPr>
+          <w:rFonts w:eastAsia="Times New Roman" w:cs="Times New Roman"/>
+        </w:rPr>
+        <w:t xml:space="preserve"> </w:t>
+      </w:r>
+      <w:proofErr w:type="spellStart"/>
+      <w:r>
+        <w:rPr>
+          <w:rFonts w:eastAsia="Times New Roman" w:cs="Times New Roman"/>
+        </w:rPr>
+        <w:t>drain</w:t>
+      </w:r>
+      <w:proofErr w:type="spellEnd"/>
+      <w:r>
+        <w:rPr>
+          <w:rFonts w:eastAsia="Times New Roman" w:cs="Times New Roman"/>
+        </w:rPr>
+        <w:t xml:space="preserve"> al celor înalt calificați.</w:t>
       </w:r>
     </w:p>
     <w:p>
@@ -1937,21 +2028,21 @@
         <w:rPr>
           <w:rFonts w:eastAsia="Times New Roman" w:cs="Times New Roman"/>
         </w:rPr>
-        <w:t xml:space="preserve">Dimensiunea socială a transformărilor pieței muncii europene se manifestă cu precădere prin schimbările în structura ocupațională, în cerințele de competențe și în sistemele de formare profesională. </w:t>
-      </w:r>
-      <w:proofErr w:type="spellStart"/>
-      <w:r>
-        <w:rPr>
-          <w:rFonts w:eastAsia="Times New Roman" w:cs="Times New Roman"/>
-        </w:rPr>
-        <w:t>Caterino</w:t>
-      </w:r>
-      <w:proofErr w:type="spellEnd"/>
-      <w:r>
-        <w:rPr>
-          <w:rFonts w:eastAsia="Times New Roman" w:cs="Times New Roman"/>
-        </w:rPr>
-        <w:t xml:space="preserve"> et al. (2025) subliniază că, în era Industriei 5.0, formarea forței de muncă devine esențială pentru succesul întreprinderilor de producție, asigurând menținerea productivității și a avantajelor competitive. Studiul identifică o distincție fundamentală între sarcinile repetitive — unde curba de învățare este bine documentată — și sarcinile non-repetitive, care implică un proces accentuat de uitare și necesită strategii de formare adaptate, integrate cu tehnologii emergente precum Realitatea Virtuală și Augmentată.</w:t>
+        <w:t xml:space="preserve">Transformarea tehnologică a pieței muncii europene constituie probabil cea mai complexă dimensiune a evoluțiilor recente. Călinescu (2023) sintetizează stadiul cunoașterii privind impactul inteligenței artificiale (IA) asupra ocupării forței de muncă în economia europeană, concluzionând că IA influențează simultan productivitatea, structura ocupațională, distribuția veniturilor și creșterea economică. Analizând studii de caz din industrii precum producție, transport, servicii financiare și bancare, autoarea arată că, deși IA are potențialul de a crește semnificativ productivitatea, aceasta poate totodată să </w:t>
+      </w:r>
+      <w:proofErr w:type="spellStart"/>
+      <w:r>
+        <w:rPr>
+          <w:rFonts w:eastAsia="Times New Roman" w:cs="Times New Roman"/>
+        </w:rPr>
+        <w:t>perturbeze</w:t>
+      </w:r>
+      <w:proofErr w:type="spellEnd"/>
+      <w:r>
+        <w:rPr>
+          <w:rFonts w:eastAsia="Times New Roman" w:cs="Times New Roman"/>
+        </w:rPr>
+        <w:t xml:space="preserve"> ocuparea forței de muncă și să genereze inegalități de venit.</w:t>
       </w:r>
     </w:p>
     <w:p>
@@ -1962,32 +2053,141 @@
         <w:rPr>
           <w:rFonts w:eastAsia="Times New Roman" w:cs="Times New Roman"/>
         </w:rPr>
-        <w:t xml:space="preserve">Autorii propun un cadru preliminar de formare care definește momentul optim pentru sesiunile de training pe baza scăderii performanței operatorilor, măsurată prin indicatori-cheie de performanță precum calitatea produsului, timpul de execuție, numărul de erori și incidentele de siguranță. </w:t>
-      </w:r>
-      <w:proofErr w:type="spellStart"/>
-      <w:r>
-        <w:rPr>
-          <w:rFonts w:eastAsia="Times New Roman" w:cs="Times New Roman"/>
-        </w:rPr>
-        <w:t>Caterino</w:t>
-      </w:r>
-      <w:proofErr w:type="spellEnd"/>
-      <w:r>
-        <w:rPr>
-          <w:rFonts w:eastAsia="Times New Roman" w:cs="Times New Roman"/>
-        </w:rPr>
-        <w:t xml:space="preserve"> et al. (2025) atrag atenția că există o lipsă semnificativă de studii care să evalueze efectele economice ale programelor de formare din perspectiva managementului — un aspect ce rămâne o direcție importantă de cercetare viitoare.</w:t>
+        <w:t>Călinescu (2023) identifică, pe baza literaturii de specialitate, că ocupațiile cele mai expuse automatizării sunt cele care implică o proporție ridicată de sarcini rutiniere sau non-autonome, în timp ce ocupațiile care necesită abilități de comunicare, colaborare și gândire critică sunt mai rezistente la substituție. Lucrătorii care nu dispun de abilități de adaptabilitate ar putea întâmpina dificultăți grave în a găsi noi oportunități de angajare, contribuind la lărgirea inegalităților de venit — o provocare structurală la adresa coeziunii sociale europene.</w:t>
       </w:r>
     </w:p>
     <w:p>
       <w:pPr>
         <w:ind w:firstLine="720"/>
       </w:pPr>
-      <w:r>
-        <w:rPr>
-          <w:rFonts w:eastAsia="Times New Roman" w:cs="Times New Roman"/>
-        </w:rPr>
-        <w:t xml:space="preserve">Complementar, Varga și </w:t>
+      <w:proofErr w:type="spellStart"/>
+      <w:r>
+        <w:rPr>
+          <w:rFonts w:eastAsia="Times New Roman" w:cs="Times New Roman"/>
+        </w:rPr>
+        <w:t>Aleca</w:t>
+      </w:r>
+      <w:proofErr w:type="spellEnd"/>
+      <w:r>
+        <w:rPr>
+          <w:rFonts w:eastAsia="Times New Roman" w:cs="Times New Roman"/>
+        </w:rPr>
+        <w:t xml:space="preserve"> și Mihai (2025) aprofundează această analiză din perspectiva relației dintre infrastructura digitală, competențele digitale și productivitatea muncii la nivelul statelor membre UE. Utilizând metode econometrice cu efecte fixe pe date panel, studiul demonstrează că competențele digitale exercită o influență puternică asupra productivității muncii în toate modelele testate, subliniind importanța capitalului uman în adoptarea tehnologiilor Industriei 4.0. Adoptarea soluțiilor cloud este identificată drept un catalizator semnificativ pentru eficiența proceselor, în timp ce variațiile în dezvoltarea infrastructurii digitale și în gradul de pregătire a forței de muncă între statele membre reprezintă provocări serioase pentru productivitatea muncii la nivel agregat.</w:t>
+      </w:r>
+    </w:p>
+    <w:p>
+      <w:pPr>
+        <w:ind w:firstLine="720"/>
+      </w:pPr>
+      <w:r>
+        <w:rPr>
+          <w:rFonts w:eastAsia="Times New Roman" w:cs="Times New Roman"/>
+        </w:rPr>
+        <w:lastRenderedPageBreak/>
+        <w:t xml:space="preserve">Caterino et al. (2025) completează această perspectivă subliniind că, în contextul industrial contemporan, tipul activităților în care sunt implicați operatorii este preponderent non-repetitiv, ceea ce impune reconfigurarea fundamentală a strategiilor de formare. Soluțiile bazate pe tehnologii </w:t>
+      </w:r>
+      <w:proofErr w:type="spellStart"/>
+      <w:r>
+        <w:rPr>
+          <w:rFonts w:eastAsia="Times New Roman" w:cs="Times New Roman"/>
+        </w:rPr>
+        <w:t>imersive</w:t>
+      </w:r>
+      <w:proofErr w:type="spellEnd"/>
+      <w:r>
+        <w:rPr>
+          <w:rFonts w:eastAsia="Times New Roman" w:cs="Times New Roman"/>
+        </w:rPr>
+        <w:t xml:space="preserve"> — Realitate Virtuală și Augmentată — sunt identificate ca răspunsuri promițătoare la această provocare, compensând procesul de uitare specific sarcinilor non-repetitive și asigurând menținerea nivelului de competență al lucrătorilor în fața dinamismului tehnologic.</w:t>
+      </w:r>
+    </w:p>
+    <w:p>
+      <w:pPr>
+        <w:ind w:firstLine="720"/>
+      </w:pPr>
+      <w:r>
+        <w:rPr>
+          <w:rFonts w:eastAsia="Times New Roman" w:cs="Times New Roman"/>
+        </w:rPr>
+        <w:t xml:space="preserve">Recenzia literaturii de specialitate relevă că piața muncii europeană se află la intersecția unor forțe transformatoare de mare amploare, care acționează simultan pe multiple dimensiuni. Din perspectivă politică, emergența noilor forme de muncă — în special munca prin platforme digitale — a depășit capacitatea de răspuns a cadrelor de reglementare existente, creând lacune semnificative de protecție socială pentru categorii vulnerabile de lucrători (OCDE, 2019; </w:t>
+      </w:r>
+      <w:proofErr w:type="spellStart"/>
+      <w:r>
+        <w:rPr>
+          <w:rFonts w:eastAsia="Times New Roman" w:cs="Times New Roman"/>
+        </w:rPr>
+        <w:t>Huws</w:t>
+      </w:r>
+      <w:proofErr w:type="spellEnd"/>
+      <w:r>
+        <w:rPr>
+          <w:rFonts w:eastAsia="Times New Roman" w:cs="Times New Roman"/>
+        </w:rPr>
+        <w:t xml:space="preserve"> et al., 2017). Politicile de migrație ale statelor membre au generat fluxuri masive de forță de muncă dinspre Europa de Est spre vest, cu consecințe ambivalente: beneficii economice pentru țările gazdă și presiuni demografice și de competențe asupra economiilor de origine (Tirca și Bujor, 2024; </w:t>
+      </w:r>
+      <w:proofErr w:type="spellStart"/>
+      <w:r>
+        <w:rPr>
+          <w:rFonts w:eastAsia="Times New Roman" w:cs="Times New Roman"/>
+        </w:rPr>
+        <w:t>Beckers</w:t>
+      </w:r>
+      <w:proofErr w:type="spellEnd"/>
+      <w:r>
+        <w:rPr>
+          <w:rFonts w:eastAsia="Times New Roman" w:cs="Times New Roman"/>
+        </w:rPr>
+        <w:t xml:space="preserve"> et al., 2024).</w:t>
+      </w:r>
+    </w:p>
+    <w:p>
+      <w:pPr>
+        <w:ind w:firstLine="720"/>
+      </w:pPr>
+      <w:r>
+        <w:rPr>
+          <w:rFonts w:eastAsia="Times New Roman" w:cs="Times New Roman"/>
+        </w:rPr>
+        <w:t xml:space="preserve">Din perspectivă economică, pandemia de COVID-19 a constituit cel mai sever test al rezilienței piețelor muncii europene din ultimele decenii. Deși impactul a fost relativ mai limitat în țările Grupului de la </w:t>
+      </w:r>
+      <w:proofErr w:type="spellStart"/>
+      <w:r>
+        <w:rPr>
+          <w:rFonts w:eastAsia="Times New Roman" w:cs="Times New Roman"/>
+        </w:rPr>
+        <w:t>Vișegrad</w:t>
+      </w:r>
+      <w:proofErr w:type="spellEnd"/>
+      <w:r>
+        <w:rPr>
+          <w:rFonts w:eastAsia="Times New Roman" w:cs="Times New Roman"/>
+        </w:rPr>
+        <w:t xml:space="preserve"> comparativ cu criza financiară anterioară (</w:t>
+      </w:r>
+      <w:proofErr w:type="spellStart"/>
+      <w:r>
+        <w:rPr>
+          <w:rFonts w:eastAsia="Times New Roman" w:cs="Times New Roman"/>
+        </w:rPr>
+        <w:t>Zieliński</w:t>
+      </w:r>
+      <w:proofErr w:type="spellEnd"/>
+      <w:r>
+        <w:rPr>
+          <w:rFonts w:eastAsia="Times New Roman" w:cs="Times New Roman"/>
+        </w:rPr>
+        <w:t>, 2022), consecințele asupra sănătății și capacității de muncă a forței active rămân o preocupare de durată (Szigeti et al., 2023). Remitențele generate de emigrație au susținut economiile de origine, dar dependența excesivă de acestea reprezintă un risc structural.</w:t>
+      </w:r>
+    </w:p>
+    <w:p>
+      <w:pPr>
+        <w:ind w:firstLine="720"/>
+      </w:pPr>
+      <w:r>
+        <w:rPr>
+          <w:rFonts w:eastAsia="Times New Roman" w:cs="Times New Roman"/>
+        </w:rPr>
+        <w:t xml:space="preserve">Dimensiunea socială a transformărilor este marcată de schimbarea structurală a cerințelor de competențe, care solicită sisteme de formare profesională mai flexibile și mai bine integrate în procesele de producție (Caterino et al., 2025). Sistemele de educație duală, documentate de Varga și </w:t>
       </w:r>
       <w:proofErr w:type="spellStart"/>
       <w:r>
@@ -2001,14 +2201,7 @@
         <w:rPr>
           <w:rFonts w:eastAsia="Times New Roman" w:cs="Times New Roman"/>
         </w:rPr>
-        <w:t xml:space="preserve"> (2024) analizează sistemele de învățământ superior dual din Uniunea Europeană, argumentând că integrarea experienței practice în parcursul academic reprezintă un răspuns structural la cerințele pieței muncii. Studiul documentează că, deși Germania și Austria funcționează ca modele de referință pentru sisteme bine structurate de educație duală, alte state membre — inclusiv România, unde Ministerul Educației a lansat în 2023 un Plan Național care prevede crearea de campusuri vocaționale integrate — se află în diverse stadii de </w:t>
-      </w:r>
-      <w:r>
-        <w:rPr>
-          <w:rFonts w:eastAsia="Times New Roman" w:cs="Times New Roman"/>
-        </w:rPr>
-        <w:lastRenderedPageBreak/>
-        <w:t>implementare. Autorii evidențiază că programele de educație duală contribuie la reducerea decalajului dintre calificările absolvenților și cerințele angajatorilor, facilitând tranziția de la educație la ocupare.</w:t>
+        <w:t xml:space="preserve"> (2024), oferă un model promițător de aliniere a educației cu nevoile pieței muncii, aflat însă în stadii diferite de implementare la nivelul statelor membre.</w:t>
       </w:r>
     </w:p>
     <w:p>
@@ -2019,115 +2212,8 @@
         <w:rPr>
           <w:rFonts w:eastAsia="Times New Roman" w:cs="Times New Roman"/>
         </w:rPr>
-        <w:t xml:space="preserve">Mobilitatea forței de muncă </w:t>
-      </w:r>
-      <w:r>
-        <w:rPr>
-          <w:rFonts w:eastAsia="Times New Roman" w:cs="Times New Roman"/>
-        </w:rPr>
-        <w:t xml:space="preserve">de tip </w:t>
-      </w:r>
-      <w:r>
-        <w:rPr>
-          <w:rFonts w:eastAsia="Times New Roman" w:cs="Times New Roman"/>
-        </w:rPr>
-        <w:t>calificat</w:t>
-      </w:r>
-      <w:r>
-        <w:rPr>
-          <w:rFonts w:eastAsia="Times New Roman" w:cs="Times New Roman"/>
-        </w:rPr>
-        <w:t xml:space="preserve"> </w:t>
-      </w:r>
-      <w:r>
-        <w:rPr>
-          <w:rFonts w:eastAsia="Times New Roman" w:cs="Times New Roman"/>
-        </w:rPr>
-        <w:t xml:space="preserve">reprezintă o altă dimensiune cu implicații profunde. </w:t>
-      </w:r>
-      <w:proofErr w:type="spellStart"/>
-      <w:r>
-        <w:rPr>
-          <w:rFonts w:eastAsia="Times New Roman" w:cs="Times New Roman"/>
-        </w:rPr>
-        <w:t>Beckers</w:t>
-      </w:r>
-      <w:proofErr w:type="spellEnd"/>
-      <w:r>
-        <w:rPr>
-          <w:rFonts w:eastAsia="Times New Roman" w:cs="Times New Roman"/>
-        </w:rPr>
-        <w:t xml:space="preserve"> et al. (2024) demonstrează că emigrarea din Balcanii de Vest a exacerbat deficitele de forță de muncă și de competențe la nivelul tuturor ocupațiunilor din regiune. Paradoxal, cercetarea arată că emigrarea netă din regiune se produce în principal în rândul persoanelor cu nivel mediu și scăzut de educație, contrazicând focalizarea exclusivă pe fenomenul </w:t>
-      </w:r>
-      <w:proofErr w:type="spellStart"/>
-      <w:r>
-        <w:rPr>
-          <w:rFonts w:eastAsia="Times New Roman" w:cs="Times New Roman"/>
-        </w:rPr>
-        <w:t>brain</w:t>
-      </w:r>
-      <w:proofErr w:type="spellEnd"/>
-      <w:r>
-        <w:rPr>
-          <w:rFonts w:eastAsia="Times New Roman" w:cs="Times New Roman"/>
-        </w:rPr>
-        <w:t xml:space="preserve"> </w:t>
-      </w:r>
-      <w:proofErr w:type="spellStart"/>
-      <w:r>
-        <w:rPr>
-          <w:rFonts w:eastAsia="Times New Roman" w:cs="Times New Roman"/>
-        </w:rPr>
-        <w:t>drain</w:t>
-      </w:r>
-      <w:proofErr w:type="spellEnd"/>
-      <w:r>
-        <w:rPr>
-          <w:rFonts w:eastAsia="Times New Roman" w:cs="Times New Roman"/>
-        </w:rPr>
-        <w:t xml:space="preserve"> al celor înalt calificați.</w:t>
-      </w:r>
-    </w:p>
-    <w:p>
-      <w:pPr>
-        <w:ind w:firstLine="720"/>
-      </w:pPr>
-      <w:r>
-        <w:rPr>
-          <w:rFonts w:eastAsia="Times New Roman" w:cs="Times New Roman"/>
-        </w:rPr>
-        <w:t xml:space="preserve">Transformarea tehnologică a pieței muncii europene constituie probabil cea mai complexă dimensiune a evoluțiilor recente. Călinescu (2023) sintetizează stadiul cunoașterii privind impactul inteligenței artificiale (IA) asupra ocupării forței de muncă în economia europeană, concluzionând că IA influențează simultan productivitatea, structura ocupațională, distribuția veniturilor și creșterea economică. Analizând studii de caz din industrii precum producție, transport, servicii financiare și bancare, autoarea arată că, deși IA are potențialul de a crește semnificativ productivitatea, aceasta poate totodată să </w:t>
-      </w:r>
-      <w:proofErr w:type="spellStart"/>
-      <w:r>
-        <w:rPr>
-          <w:rFonts w:eastAsia="Times New Roman" w:cs="Times New Roman"/>
-        </w:rPr>
-        <w:t>perturbeze</w:t>
-      </w:r>
-      <w:proofErr w:type="spellEnd"/>
-      <w:r>
-        <w:rPr>
-          <w:rFonts w:eastAsia="Times New Roman" w:cs="Times New Roman"/>
-        </w:rPr>
-        <w:t xml:space="preserve"> ocuparea forței de muncă și să genereze inegalități de venit.</w:t>
-      </w:r>
-    </w:p>
-    <w:p>
-      <w:pPr>
-        <w:ind w:firstLine="720"/>
-      </w:pPr>
-      <w:r>
-        <w:rPr>
-          <w:rFonts w:eastAsia="Times New Roman" w:cs="Times New Roman"/>
-        </w:rPr>
-        <w:t>Călinescu (2023) identifică, pe baza literaturii de specialitate, că ocupațiile cele mai expuse automatizării sunt cele care implică o proporție ridicată de sarcini rutiniere sau non-autonome, în timp ce ocupațiile care necesită abilități de comunicare, colaborare și gândire critică sunt mai rezistente la substituție. Lucrătorii care nu dispun de abilități de adaptabilitate ar putea întâmpina dificultăți grave în a găsi noi oportunități de angajare, contribuind la lărgirea inegalităților de venit — o provocare structurală la adresa coeziunii sociale europene.</w:t>
-      </w:r>
-    </w:p>
-    <w:p>
-      <w:pPr>
-        <w:ind w:firstLine="720"/>
-      </w:pPr>
+        <w:t xml:space="preserve">Din perspectivă tehnologică, digitalizarea și inteligența artificială reconfigurează profund structura ocupațională europeană. Studiile lui Călinescu (2023) și </w:t>
+      </w:r>
       <w:proofErr w:type="spellStart"/>
       <w:r>
         <w:rPr>
@@ -2140,220 +2226,9 @@
         <w:rPr>
           <w:rFonts w:eastAsia="Times New Roman" w:cs="Times New Roman"/>
         </w:rPr>
-        <w:t xml:space="preserve"> și Mihai (2025) aprofundează această analiză din perspectiva relației dintre infrastructura digitală, competențele digitale și productivitatea muncii la nivelul statelor membre UE. Utilizând metode econometrice cu efecte fixe pe date panel, studiul demonstrează că competențele digitale exercită o influență puternică asupra productivității muncii în toate modelele testate, subliniind importanța capitalului uman în adoptarea tehnologiilor Industriei 4.0. Adoptarea soluțiilor </w:t>
-      </w:r>
-      <w:proofErr w:type="spellStart"/>
-      <w:r>
-        <w:rPr>
-          <w:rFonts w:eastAsia="Times New Roman" w:cs="Times New Roman"/>
-        </w:rPr>
-        <w:t>cloud</w:t>
-      </w:r>
-      <w:proofErr w:type="spellEnd"/>
-      <w:r>
-        <w:rPr>
-          <w:rFonts w:eastAsia="Times New Roman" w:cs="Times New Roman"/>
-        </w:rPr>
-        <w:t xml:space="preserve"> este identificată drept un catalizator semnificativ pentru eficiența proceselor, în timp ce variațiile în dezvoltarea infrastructurii digitale și în gradul de pregătire a forței de muncă între statele membre reprezintă provocări serioase pentru productivitatea muncii la nivel agregat.</w:t>
-      </w:r>
-    </w:p>
-    <w:p>
-      <w:pPr>
-        <w:ind w:firstLine="720"/>
-      </w:pPr>
-      <w:proofErr w:type="spellStart"/>
-      <w:r>
-        <w:rPr>
-          <w:rFonts w:eastAsia="Times New Roman" w:cs="Times New Roman"/>
-        </w:rPr>
-        <w:t>Caterino</w:t>
-      </w:r>
-      <w:proofErr w:type="spellEnd"/>
-      <w:r>
-        <w:rPr>
-          <w:rFonts w:eastAsia="Times New Roman" w:cs="Times New Roman"/>
-        </w:rPr>
-        <w:t xml:space="preserve"> et al. (2025) completează această perspectivă subliniind că, în contextul industrial contemporan, tipul activităților în care sunt implicați operatorii este preponderent non-repetitiv, </w:t>
-      </w:r>
-      <w:r>
-        <w:rPr>
-          <w:rFonts w:eastAsia="Times New Roman" w:cs="Times New Roman"/>
-        </w:rPr>
-        <w:lastRenderedPageBreak/>
-        <w:t xml:space="preserve">ceea ce impune reconfigurarea fundamentală a strategiilor de formare. Soluțiile bazate pe tehnologii </w:t>
-      </w:r>
-      <w:proofErr w:type="spellStart"/>
-      <w:r>
-        <w:rPr>
-          <w:rFonts w:eastAsia="Times New Roman" w:cs="Times New Roman"/>
-        </w:rPr>
-        <w:t>imersive</w:t>
-      </w:r>
-      <w:proofErr w:type="spellEnd"/>
-      <w:r>
-        <w:rPr>
-          <w:rFonts w:eastAsia="Times New Roman" w:cs="Times New Roman"/>
-        </w:rPr>
-        <w:t xml:space="preserve"> — Realitate Virtuală și Augmentată — sunt identificate ca răspunsuri promițătoare la această provocare, compensând procesul de uitare specific sarcinilor non-repetitive și asigurând menținerea nivelului de competență al lucrătorilor în fața dinamismului tehnologic.</w:t>
-      </w:r>
-    </w:p>
-    <w:p>
-      <w:pPr>
-        <w:ind w:firstLine="720"/>
-      </w:pPr>
-      <w:r>
-        <w:rPr>
-          <w:rFonts w:eastAsia="Times New Roman" w:cs="Times New Roman"/>
-        </w:rPr>
-        <w:t xml:space="preserve">Recenzia literaturii de specialitate relevă că piața muncii europeană se află la intersecția unor forțe transformatoare de mare amploare, care acționează simultan pe multiple dimensiuni. Din perspectivă politică, emergența noilor forme de muncă — în special munca prin platforme digitale — a depășit capacitatea de răspuns a cadrelor de reglementare existente, creând lacune semnificative de protecție socială pentru categorii vulnerabile de lucrători (OCDE, 2019; </w:t>
-      </w:r>
-      <w:proofErr w:type="spellStart"/>
-      <w:r>
-        <w:rPr>
-          <w:rFonts w:eastAsia="Times New Roman" w:cs="Times New Roman"/>
-        </w:rPr>
-        <w:t>Huws</w:t>
-      </w:r>
-      <w:proofErr w:type="spellEnd"/>
-      <w:r>
-        <w:rPr>
-          <w:rFonts w:eastAsia="Times New Roman" w:cs="Times New Roman"/>
-        </w:rPr>
-        <w:t xml:space="preserve"> et al., 2017). Politicile de migrație ale statelor membre au generat fluxuri masive de forță de muncă dinspre Europa de Est spre vest, cu consecințe ambivalente: beneficii economice pentru țările gazdă și presiuni demografice și de competențe asupra economiilor de origine (</w:t>
-      </w:r>
-      <w:proofErr w:type="spellStart"/>
-      <w:r>
-        <w:rPr>
-          <w:rFonts w:eastAsia="Times New Roman" w:cs="Times New Roman"/>
-        </w:rPr>
-        <w:t>Tirca</w:t>
-      </w:r>
-      <w:proofErr w:type="spellEnd"/>
-      <w:r>
-        <w:rPr>
-          <w:rFonts w:eastAsia="Times New Roman" w:cs="Times New Roman"/>
-        </w:rPr>
-        <w:t xml:space="preserve"> și Bujor, 2024; </w:t>
-      </w:r>
-      <w:proofErr w:type="spellStart"/>
-      <w:r>
-        <w:rPr>
-          <w:rFonts w:eastAsia="Times New Roman" w:cs="Times New Roman"/>
-        </w:rPr>
-        <w:t>Beckers</w:t>
-      </w:r>
-      <w:proofErr w:type="spellEnd"/>
-      <w:r>
-        <w:rPr>
-          <w:rFonts w:eastAsia="Times New Roman" w:cs="Times New Roman"/>
-        </w:rPr>
-        <w:t xml:space="preserve"> et al., 2024).</w:t>
-      </w:r>
-    </w:p>
-    <w:p>
-      <w:pPr>
-        <w:ind w:firstLine="720"/>
-      </w:pPr>
-      <w:r>
-        <w:rPr>
-          <w:rFonts w:eastAsia="Times New Roman" w:cs="Times New Roman"/>
-        </w:rPr>
-        <w:t xml:space="preserve">Din perspectivă economică, pandemia de COVID-19 a constituit cel mai sever test al rezilienței piețelor muncii europene din ultimele decenii. Deși impactul a fost relativ mai limitat în țările Grupului de la </w:t>
-      </w:r>
-      <w:proofErr w:type="spellStart"/>
-      <w:r>
-        <w:rPr>
-          <w:rFonts w:eastAsia="Times New Roman" w:cs="Times New Roman"/>
-        </w:rPr>
-        <w:t>Vișegrad</w:t>
-      </w:r>
-      <w:proofErr w:type="spellEnd"/>
-      <w:r>
-        <w:rPr>
-          <w:rFonts w:eastAsia="Times New Roman" w:cs="Times New Roman"/>
-        </w:rPr>
-        <w:t xml:space="preserve"> comparativ cu criza financiară anterioară (</w:t>
-      </w:r>
-      <w:proofErr w:type="spellStart"/>
-      <w:r>
-        <w:rPr>
-          <w:rFonts w:eastAsia="Times New Roman" w:cs="Times New Roman"/>
-        </w:rPr>
-        <w:t>Zieliński</w:t>
-      </w:r>
-      <w:proofErr w:type="spellEnd"/>
-      <w:r>
-        <w:rPr>
-          <w:rFonts w:eastAsia="Times New Roman" w:cs="Times New Roman"/>
-        </w:rPr>
-        <w:t>, 2022), consecințele asupra sănătății și capacității de muncă a forței active rămân o preocupare de durată (Szigeti et al., 2023). Remitențele generate de emigrație au susținut economiile de origine, dar dependența excesivă de acestea reprezintă un risc structural.</w:t>
-      </w:r>
-    </w:p>
-    <w:p>
-      <w:pPr>
-        <w:ind w:firstLine="720"/>
-      </w:pPr>
-      <w:r>
-        <w:rPr>
-          <w:rFonts w:eastAsia="Times New Roman" w:cs="Times New Roman"/>
-        </w:rPr>
-        <w:t>Dimensiunea socială a transformărilor este marcată de schimbarea structurală a cerințelor de competențe, care solicită sisteme de formare profesională mai flexibile și mai bine integrate în procesele de producție (</w:t>
-      </w:r>
-      <w:proofErr w:type="spellStart"/>
-      <w:r>
-        <w:rPr>
-          <w:rFonts w:eastAsia="Times New Roman" w:cs="Times New Roman"/>
-        </w:rPr>
-        <w:t>Caterino</w:t>
-      </w:r>
-      <w:proofErr w:type="spellEnd"/>
-      <w:r>
-        <w:rPr>
-          <w:rFonts w:eastAsia="Times New Roman" w:cs="Times New Roman"/>
-        </w:rPr>
-        <w:t xml:space="preserve"> et al., 2025). Sistemele de educație duală, documentate de Varga și </w:t>
-      </w:r>
-      <w:proofErr w:type="spellStart"/>
-      <w:r>
-        <w:rPr>
-          <w:rFonts w:eastAsia="Times New Roman" w:cs="Times New Roman"/>
-        </w:rPr>
-        <w:t>Sági</w:t>
-      </w:r>
-      <w:proofErr w:type="spellEnd"/>
-      <w:r>
-        <w:rPr>
-          <w:rFonts w:eastAsia="Times New Roman" w:cs="Times New Roman"/>
-        </w:rPr>
-        <w:t xml:space="preserve"> (2024), oferă un model promițător de aliniere a educației cu nevoile pieței muncii, aflat însă în stadii diferite de implementare la nivelul statelor membre.</w:t>
-      </w:r>
-    </w:p>
-    <w:p>
-      <w:pPr>
-        <w:ind w:firstLine="720"/>
-      </w:pPr>
-      <w:r>
-        <w:rPr>
-          <w:rFonts w:eastAsia="Times New Roman" w:cs="Times New Roman"/>
-        </w:rPr>
-        <w:t xml:space="preserve">Din perspectivă tehnologică, digitalizarea și inteligența artificială reconfigurează profund structura ocupațională europeană. Studiile lui Călinescu (2023) și </w:t>
-      </w:r>
-      <w:proofErr w:type="spellStart"/>
-      <w:r>
-        <w:rPr>
-          <w:rFonts w:eastAsia="Times New Roman" w:cs="Times New Roman"/>
-        </w:rPr>
-        <w:t>Aleca</w:t>
-      </w:r>
-      <w:proofErr w:type="spellEnd"/>
-      <w:r>
-        <w:rPr>
-          <w:rFonts w:eastAsia="Times New Roman" w:cs="Times New Roman"/>
-        </w:rPr>
         <w:t xml:space="preserve"> și Mihai (2025) converg spre concluzia că investițiile strategice în infrastructura digitală și în competențele digitale ale forței de muncă sunt esențiale pentru competitivitatea economică, dar că distribuția inegală a beneficiilor tehnologice între statele membre riscă să amplifice disparitățile existente. Aceste concluzii definesc cadrul teoretic și contextul empiric pe baza cărora se construiește demersul de cercetare al prezentei lucrări.</w:t>
       </w:r>
     </w:p>
-    <w:p/>
     <w:p>
       <w:pPr>
         <w:pStyle w:val="Heading1"/>
@@ -2407,7 +2282,6 @@
         <w:t>În ceea ce privește piața forței de muncă, Eurostat pune la dispoziție o gamă variată de indicatori, printre care rata șomajului, rata de ocupare a forței de muncă, rata de activitate și câștigurile salariale medii. Principala sursă de date utilizată de Eurostat în acest domeniu este Ancheta asupra Forței de Muncă (Labour Force Survey – LFS), realizată trimestrial în toate statele membre pe baza unei metodologii comune, ceea ce permite compararea rezultatelor între țări în mod direct. Datele sunt disponibile gratuit pe portalul oficial și sunt actualizate periodic, ceea ce face din Eurostat sursa de date aleasă pentru prezenta lucrare.</w:t>
       </w:r>
     </w:p>
-    <w:p/>
     <w:p>
       <w:pPr>
         <w:pStyle w:val="Heading3"/>
@@ -2436,10 +2310,7 @@
     </w:p>
     <w:p>
       <w:r>
-        <w:t>Concret, pentru Cipru au fost estimate valorile corespunzătoare anilor 2015 și 2016, folosind ca referință Grecia, Slovenia și Portugalia, fiind economii mici sau medii din zona euro, cu niveluri de dezvoltare comparabile. Pornind de la prima valoare disponibilă a Ciprului, din 2017, s-a calculat rata medie de creștere a țărilor de referință pentru intervalul 2016–2017 și s-a inversat aceasta pentru a obține estimarea anului 2016. Același procedeu a fost aplicat și pentru anul 2015, de data aceasta folosind rata aferentă intervalului 2015–2016. O abordare similară, însă în sens direct, a fost utilizată și pentru Elveția și Norvegia în cadrul setului de date privind PIB-ul, unde valorile lipsă vizau ani mai recenți. Acestea sunt economii dezvoltate din Europa de Nord și Centrală, iar țările alese ca referință prezintă caracteristici economice comparabile, și anume Austria și Olanda în cazul Elveției, respectiv Suedia, Danemarca și Finlanda în cazul Norvegiei. Pornind de la ultima valoare disponibilă a fiecărei țări, s-a aplicat rata medie de creștere a statelor de referință pentru a proiecta valoarea estimată în anii următori.</w:t>
-      </w:r>
-      <w:r>
-        <w:t xml:space="preserve"> </w:t>
+        <w:t xml:space="preserve">Concret, pentru Cipru au fost estimate valorile corespunzătoare anilor 2015 și 2016, folosind ca referință Grecia, Slovenia și Portugalia, fiind economii mici sau medii din zona euro, cu niveluri de dezvoltare comparabile. Pornind de la prima valoare disponibilă a Ciprului, din 2017, s-a calculat rata medie de creștere a țărilor de referință pentru intervalul 2016–2017 și s-a inversat aceasta pentru a obține estimarea anului 2016. Același procedeu a fost aplicat și pentru anul 2015, de data aceasta folosind rata aferentă intervalului 2015–2016. O abordare similară, însă în sens direct, a fost utilizată și pentru Elveția și Norvegia în cadrul setului de date privind PIB-ul, unde valorile lipsă vizau ani mai recenți. Acestea sunt economii dezvoltate din Europa de Nord și Centrală, iar țările alese ca referință prezintă caracteristici economice comparabile, și anume Austria și Olanda în cazul Elveției, respectiv Suedia, Danemarca și Finlanda în cazul Norvegiei. Pornind de la ultima valoare disponibilă a fiecărei țări, s-a aplicat rata medie de creștere a statelor de referință pentru a proiecta valoarea estimată în anii următori. </w:t>
       </w:r>
       <w:r>
         <w:t>La finalul procesului de preprocesare, seturile de date curate și complete au fost salvate local în format CSV, urmând a fi utilizate în etapele de analiză descriptivă și modelare statistică.</w:t>
@@ -2528,48 +2399,56 @@
       <w:bookmarkEnd w:id="17"/>
     </w:p>
     <w:p>
-      <w:r>
-        <w:t>Productivitatea muncii, exprimată în euro per oră lucrată, înregistrează o tendință de creștere de-a lungul întregii perioade analizate. Media europeană a crescut de la 35.6 €/oră în 2015 la 51 €/oră în 2024, ceea ce indică o îmbunătățire generală a eficienței cu care forța de muncă este utilizată la nivel continental. Un aspect important de menționat este că în fiecare an media este semnificativ mai mare decât mediana, care a crescut de la 26.5 €/oră în 2015 la 37.9 €/oră în 2024. Această diferență apare din cauza câtorva țări cu valori foarte ridicate care trag media în sus, mediana fiind în acest caz un indicator mai reprezentativ pentru situația tipică a unei țări europene.</w:t>
-      </w:r>
-    </w:p>
-    <w:p>
-      <w:r>
-        <w:t xml:space="preserve">Luxemburg și Irlanda se detașează clar față de restul țărilor în toți anii analizați, cu medii de 122 €/oră, respectiv 93 €/oră pe întreaga perioadă. Această poziție este explicată în mare parte de faptul că ambele țări găzduiesc un număr mare de companii multinaționale care înregistrează local o parte importantă din activitatea lor europeană, ceea ce face ca PIB-ul să fie disproporționat de mare față de dimensiunea reală a forței de muncă. Norvegia și Elveția urmează cu valori medii de </w:t>
+      <w:pPr>
+        <w:rPr>
+          <w:lang w:val="en-RO"/>
+        </w:rPr>
+      </w:pPr>
+      <w:r>
+        <w:t>Productivitatea muncii, exprimată în euro per oră lucrată, înregistrează o tendință de creștere de-a lungul întregii perioade analizate. Astfel cum se poate observa în Tabelul nr. 1, media europeană a crescut de la 35,6 €/oră în 2015 la 51 €/oră în 2024, ceea ce indică o îmbunătățire generală a eficienței cu care forța de muncă este utilizată la nivel continental. Un aspect important de menționat este că în fiecare an media este semnificativ mai mare decât mediana, care a crescut de la 26,5 €/oră în 2015 la 37,9 €/oră în 2024. Această diferență apare din cauza câtorva țări cu valori foarte ridicate care trag media în sus, mediana fiind în acest caz un indicator mai reprezentativ pentru situația tipică a unei țări europene.</w:t>
+      </w:r>
+    </w:p>
+    <w:p>
+      <w:r>
+        <w:t xml:space="preserve">Luxemburg și Irlanda se detașează clar față de restul țărilor în toți anii analizați, cu medii de 122 €/oră, respectiv 93 €/oră pe întreaga perioadă, după cum reiese din Tabelul nr. 2. Această poziție este explicată în mare parte de faptul că ambele țări găzduiesc un număr mare de companii multinaționale care înregistrează local o parte importantă din activitatea lor europeană, ceea ce </w:t>
       </w:r>
       <w:r>
         <w:lastRenderedPageBreak/>
-        <w:t>aproximativ 85 €/oră, respectiv 84 €/oră, reflectând economii dezvoltate cu sectoare de activitate cu valoare adăugată mare.</w:t>
-      </w:r>
-    </w:p>
-    <w:p>
-      <w:r>
-        <w:t>Un lucru care iese în evidență din analiza graficelor este că ierarhia țărilor rămâne practic neschimbată de-a lungul întregii perioade, inclusiv în 2020. Deși pandemia de COVID-19 a afectat economiile europene, aceasta nu pare să fi schimbat semnificativ poziția țărilor din punct de vedere al productivității. Acest lucru sugerează că productivitatea muncii este determinată de factori pe termen lung, precum nivelul de educație sau gradul de tehnologizare al economiei, și nu reacționează rapid la șocuri conjuncturale.</w:t>
-      </w:r>
-    </w:p>
-    <w:p>
-      <w:r>
-        <w:t>La polul opus, România și Bulgaria înregistrează cele mai scăzute valori din grupul analizat, cu medii de 14.5 €/oră, respectiv 11.5 €/oră. Deși ambele țări înregistrează o creștere în termeni absoluți de-a lungul perioadei, decalajul față de țările din vestul Europei se menține, ceea ce arată că procesul de convergență economică este unul lent. Germania, deși este cea mai mare economie din set, se situează sub media subgrupului analizat, cu o medie de 49.8 €/oră, ceea ce arată că dimensiunea unei economii nu se traduce automat într-o productivitate per oră ridicată.</w:t>
-      </w:r>
-    </w:p>
-    <w:p/>
-    <w:p>
+        <w:t>face ca PIB-ul să fie disproporționat de mare față de dimensiunea reală a forței de muncă. Norvegia și Elveția urmează cu valori medii de aproximativ 85 €/oră, respectiv 84 €/oră, reflectând economii dezvoltate cu sectoare de activitate cu valoare adăugată mare.</w:t>
+      </w:r>
+    </w:p>
+    <w:p>
+      <w:r>
+        <w:t>Un lucru care iese în evidență din analiza comparativă a graficelor (Figura nr. 1, Figura nr. 2, Figura nr. 3 și Figura nr. 4) este că ierarhia țărilor rămâne practic neschimbată de-a lungul întregii perioade, inclusiv în 2020. Deși pandemia de COVID-19 a afectat economiile europene, aceasta nu pare să fi schimbat semnificativ poziția țărilor din punct de vedere al productivității, Luxemburg menținându-și poziția de lider cu 115,9 €/oră în 2020 față de 110,8 €/oră în 2019 (Figura nr. 1 și Figura nr. 2). Acest lucru sugerează că productivitatea muncii este determinată de factori pe termen lung, precum nivelul de educație sau gradul de tehnologizare al economiei, și nu reacționează rapid la șocuri conjuncturale.</w:t>
+      </w:r>
+    </w:p>
+    <w:p>
+      <w:r>
+        <w:t>La polul opus, România și Bulgaria înregistrează cele mai scăzute valori din grupul analizat, cu medii de 14,5 €/oră, respectiv 11,5 €/oră, conform Tabelului nr. 2. Deși ambele țări înregistrează o creștere în termeni absoluți de-a lungul perioadei — România de la 13 €/oră în 2019 (Figura nr. 1) la 22,6 €/oră în 2024 (Figura nr. 4) — decalajul față de țările din vestul Europei se menține, ceea ce arată că procesul de convergență economică este unul lent. Germania, deși este cea mai mare economie din set, se situează sub media subgrupului analizat, cu o medie de 49,8 €/oră conform Tabelului nr. 2, ceea ce arată că dimensiunea unei economii nu se traduce automat într-o productivitate per oră ridicată.</w:t>
+      </w:r>
+    </w:p>
+    <w:p>
+      <w:pPr>
+        <w:pStyle w:val="titlufiguri"/>
+        <w:jc w:val="both"/>
+      </w:pPr>
       <w:r>
         <w:rPr>
           <w:noProof/>
         </w:rPr>
         <w:drawing>
-          <wp:anchor distT="0" distB="0" distL="114300" distR="114300" simplePos="0" relativeHeight="251663360" behindDoc="0" locked="0" layoutInCell="1" allowOverlap="1" wp14:anchorId="482A5306" wp14:editId="6C8E312E">
+          <wp:anchor distT="0" distB="0" distL="114300" distR="114300" simplePos="0" relativeHeight="251666432" behindDoc="0" locked="0" layoutInCell="1" allowOverlap="1" wp14:anchorId="4CB04D0D" wp14:editId="01333DD9">
             <wp:simplePos x="0" y="0"/>
             <wp:positionH relativeFrom="column">
-              <wp:posOffset>3224778</wp:posOffset>
+              <wp:posOffset>3067050</wp:posOffset>
             </wp:positionH>
             <wp:positionV relativeFrom="paragraph">
-              <wp:posOffset>479232</wp:posOffset>
+              <wp:posOffset>153035</wp:posOffset>
             </wp:positionV>
-            <wp:extent cx="3080385" cy="2774950"/>
-            <wp:effectExtent l="0" t="0" r="5715" b="6350"/>
+            <wp:extent cx="3063600" cy="2677104"/>
+            <wp:effectExtent l="0" t="0" r="0" b="3175"/>
             <wp:wrapTopAndBottom/>
-            <wp:docPr id="41395278" name="Picture 10"/>
+            <wp:docPr id="1911260766" name="Picture 8"/>
             <wp:cNvGraphicFramePr>
               <a:graphicFrameLocks xmlns:a="http://schemas.openxmlformats.org/drawingml/2006/main" noChangeAspect="1"/>
             </wp:cNvGraphicFramePr>
@@ -2577,20 +2456,18 @@
               <a:graphicData uri="http://schemas.openxmlformats.org/drawingml/2006/picture">
                 <pic:pic xmlns:pic="http://schemas.openxmlformats.org/drawingml/2006/picture">
                   <pic:nvPicPr>
-                    <pic:cNvPr id="0" name="Picture 10"/>
-                    <pic:cNvPicPr>
-                      <a:picLocks noChangeAspect="1" noChangeArrowheads="1"/>
-                    </pic:cNvPicPr>
+                    <pic:cNvPr id="1911260766" name="Picture 1911260766"/>
+                    <pic:cNvPicPr/>
                   </pic:nvPicPr>
-                  <pic:blipFill>
-                    <a:blip r:embed="rId7">
+                  <pic:blipFill rotWithShape="1">
+                    <a:blip r:embed="rId7" cstate="print">
                       <a:extLst>
                         <a:ext uri="{28A0092B-C50C-407E-A947-70E740481C1C}">
                           <a14:useLocalDpi xmlns:a14="http://schemas.microsoft.com/office/drawing/2010/main" val="0"/>
                         </a:ext>
                       </a:extLst>
                     </a:blip>
-                    <a:srcRect/>
+                    <a:srcRect l="814" t="5518" b="1246"/>
                     <a:stretch>
                       <a:fillRect/>
                     </a:stretch>
@@ -2598,23 +2475,27 @@
                   <pic:spPr bwMode="auto">
                     <a:xfrm>
                       <a:off x="0" y="0"/>
-                      <a:ext cx="3080385" cy="2774950"/>
+                      <a:ext cx="3063600" cy="2677104"/>
                     </a:xfrm>
                     <a:prstGeom prst="rect">
                       <a:avLst/>
                     </a:prstGeom>
-                    <a:noFill/>
                     <a:ln>
                       <a:noFill/>
                     </a:ln>
+                    <a:extLst>
+                      <a:ext uri="{53640926-AAD7-44D8-BBD7-CCE9431645EC}">
+                        <a14:shadowObscured xmlns:a14="http://schemas.microsoft.com/office/drawing/2010/main"/>
+                      </a:ext>
+                    </a:extLst>
                   </pic:spPr>
                 </pic:pic>
               </a:graphicData>
             </a:graphic>
-            <wp14:sizeRelH relativeFrom="margin">
+            <wp14:sizeRelH relativeFrom="page">
               <wp14:pctWidth>0</wp14:pctWidth>
             </wp14:sizeRelH>
-            <wp14:sizeRelV relativeFrom="margin">
+            <wp14:sizeRelV relativeFrom="page">
               <wp14:pctHeight>0</wp14:pctHeight>
             </wp14:sizeRelV>
           </wp:anchor>
@@ -2625,18 +2506,18 @@
           <w:noProof/>
         </w:rPr>
         <w:drawing>
-          <wp:anchor distT="0" distB="0" distL="114300" distR="114300" simplePos="0" relativeHeight="251658240" behindDoc="0" locked="0" layoutInCell="1" allowOverlap="1" wp14:anchorId="13DF925A" wp14:editId="05876B60">
+          <wp:anchor distT="0" distB="0" distL="114300" distR="114300" simplePos="0" relativeHeight="251664384" behindDoc="0" locked="0" layoutInCell="1" allowOverlap="1" wp14:anchorId="39541A67" wp14:editId="43A25936">
             <wp:simplePos x="0" y="0"/>
             <wp:positionH relativeFrom="column">
-              <wp:posOffset>-232051</wp:posOffset>
+              <wp:posOffset>-267970</wp:posOffset>
             </wp:positionH>
             <wp:positionV relativeFrom="paragraph">
-              <wp:posOffset>320123</wp:posOffset>
+              <wp:posOffset>153035</wp:posOffset>
             </wp:positionV>
-            <wp:extent cx="3230245" cy="2909570"/>
-            <wp:effectExtent l="0" t="0" r="8255" b="5080"/>
-            <wp:wrapTopAndBottom/>
-            <wp:docPr id="1441966993" name="Picture 9"/>
+            <wp:extent cx="3060551" cy="2700000"/>
+            <wp:effectExtent l="0" t="0" r="635" b="5715"/>
+            <wp:wrapSquare wrapText="bothSides"/>
+            <wp:docPr id="1830674414" name="Picture 7"/>
             <wp:cNvGraphicFramePr>
               <a:graphicFrameLocks xmlns:a="http://schemas.openxmlformats.org/drawingml/2006/main" noChangeAspect="1"/>
             </wp:cNvGraphicFramePr>
@@ -2644,20 +2525,18 @@
               <a:graphicData uri="http://schemas.openxmlformats.org/drawingml/2006/picture">
                 <pic:pic xmlns:pic="http://schemas.openxmlformats.org/drawingml/2006/picture">
                   <pic:nvPicPr>
-                    <pic:cNvPr id="0" name="Picture 9"/>
-                    <pic:cNvPicPr>
-                      <a:picLocks noChangeAspect="1" noChangeArrowheads="1"/>
-                    </pic:cNvPicPr>
+                    <pic:cNvPr id="1830674414" name="Picture 1830674414"/>
+                    <pic:cNvPicPr/>
                   </pic:nvPicPr>
-                  <pic:blipFill>
-                    <a:blip r:embed="rId8">
+                  <pic:blipFill rotWithShape="1">
+                    <a:blip r:embed="rId8" cstate="print">
                       <a:extLst>
                         <a:ext uri="{28A0092B-C50C-407E-A947-70E740481C1C}">
                           <a14:useLocalDpi xmlns:a14="http://schemas.microsoft.com/office/drawing/2010/main" val="0"/>
                         </a:ext>
                       </a:extLst>
                     </a:blip>
-                    <a:srcRect/>
+                    <a:srcRect t="5716" b="1235"/>
                     <a:stretch>
                       <a:fillRect/>
                     </a:stretch>
@@ -2665,23 +2544,27 @@
                   <pic:spPr bwMode="auto">
                     <a:xfrm>
                       <a:off x="0" y="0"/>
-                      <a:ext cx="3230245" cy="2909570"/>
+                      <a:ext cx="3060551" cy="2700000"/>
                     </a:xfrm>
                     <a:prstGeom prst="rect">
                       <a:avLst/>
                     </a:prstGeom>
-                    <a:noFill/>
                     <a:ln>
                       <a:noFill/>
                     </a:ln>
+                    <a:extLst>
+                      <a:ext uri="{53640926-AAD7-44D8-BBD7-CCE9431645EC}">
+                        <a14:shadowObscured xmlns:a14="http://schemas.microsoft.com/office/drawing/2010/main"/>
+                      </a:ext>
+                    </a:extLst>
                   </pic:spPr>
                 </pic:pic>
               </a:graphicData>
             </a:graphic>
-            <wp14:sizeRelH relativeFrom="margin">
+            <wp14:sizeRelH relativeFrom="page">
               <wp14:pctWidth>0</wp14:pctWidth>
             </wp14:sizeRelH>
-            <wp14:sizeRelV relativeFrom="margin">
+            <wp14:sizeRelV relativeFrom="page">
               <wp14:pctHeight>0</wp14:pctHeight>
             </wp14:sizeRelV>
           </wp:anchor>
@@ -2689,28 +2572,56 @@
       </w:r>
     </w:p>
     <w:p/>
-    <w:p/>
-    <w:p/>
-    <w:p/>
-    <w:p>
+    <w:p>
+      <w:pPr>
+        <w:pStyle w:val="titlufiguri"/>
+      </w:pPr>
+      <w:r>
+        <w:t xml:space="preserve">Fig. 1. Productivitatea muncii – 2019 ( € / oră ) </w:t>
+      </w:r>
+      <w:r>
+        <w:tab/>
+      </w:r>
+      <w:r>
+        <w:tab/>
+        <w:t xml:space="preserve">          Fig. 2. Productivitatea muncii – 2020 ( € / oră )</w:t>
+      </w:r>
+    </w:p>
+    <w:p>
+      <w:pPr>
+        <w:spacing w:line="278" w:lineRule="auto"/>
+        <w:ind w:firstLine="0"/>
+        <w:jc w:val="left"/>
+        <w:rPr>
+          <w:sz w:val="20"/>
+        </w:rPr>
+      </w:pPr>
+      <w:r>
+        <w:br w:type="page"/>
+      </w:r>
+    </w:p>
+    <w:p>
+      <w:pPr>
+        <w:ind w:firstLine="0"/>
+      </w:pPr>
       <w:r>
         <w:rPr>
           <w:noProof/>
         </w:rPr>
         <w:lastRenderedPageBreak/>
         <w:drawing>
-          <wp:anchor distT="0" distB="0" distL="114300" distR="114300" simplePos="0" relativeHeight="251660288" behindDoc="0" locked="0" layoutInCell="1" allowOverlap="1" wp14:anchorId="4C26D9B5" wp14:editId="3E368607">
+          <wp:anchor distT="0" distB="0" distL="114300" distR="114300" simplePos="0" relativeHeight="251668480" behindDoc="0" locked="0" layoutInCell="1" allowOverlap="1" wp14:anchorId="134B423D" wp14:editId="1CC3B24E">
             <wp:simplePos x="0" y="0"/>
             <wp:positionH relativeFrom="column">
-              <wp:posOffset>-581660</wp:posOffset>
+              <wp:posOffset>3243741</wp:posOffset>
             </wp:positionH>
             <wp:positionV relativeFrom="paragraph">
-              <wp:posOffset>376555</wp:posOffset>
+              <wp:posOffset>300453</wp:posOffset>
             </wp:positionV>
-            <wp:extent cx="3441700" cy="3100705"/>
-            <wp:effectExtent l="0" t="0" r="6350" b="4445"/>
+            <wp:extent cx="3051864" cy="2696400"/>
+            <wp:effectExtent l="0" t="0" r="0" b="0"/>
             <wp:wrapTopAndBottom/>
-            <wp:docPr id="1534577969" name="Picture 11"/>
+            <wp:docPr id="597741982" name="Picture 4"/>
             <wp:cNvGraphicFramePr>
               <a:graphicFrameLocks xmlns:a="http://schemas.openxmlformats.org/drawingml/2006/main" noChangeAspect="1"/>
             </wp:cNvGraphicFramePr>
@@ -2718,20 +2629,18 @@
               <a:graphicData uri="http://schemas.openxmlformats.org/drawingml/2006/picture">
                 <pic:pic xmlns:pic="http://schemas.openxmlformats.org/drawingml/2006/picture">
                   <pic:nvPicPr>
-                    <pic:cNvPr id="0" name="Picture 11"/>
-                    <pic:cNvPicPr>
-                      <a:picLocks noChangeAspect="1" noChangeArrowheads="1"/>
-                    </pic:cNvPicPr>
+                    <pic:cNvPr id="597741982" name="Picture 597741982"/>
+                    <pic:cNvPicPr/>
                   </pic:nvPicPr>
-                  <pic:blipFill>
-                    <a:blip r:embed="rId9">
+                  <pic:blipFill rotWithShape="1">
+                    <a:blip r:embed="rId9" cstate="print">
                       <a:extLst>
                         <a:ext uri="{28A0092B-C50C-407E-A947-70E740481C1C}">
                           <a14:useLocalDpi xmlns:a14="http://schemas.microsoft.com/office/drawing/2010/main" val="0"/>
                         </a:ext>
                       </a:extLst>
                     </a:blip>
-                    <a:srcRect/>
+                    <a:srcRect t="4948"/>
                     <a:stretch>
                       <a:fillRect/>
                     </a:stretch>
@@ -2739,23 +2648,27 @@
                   <pic:spPr bwMode="auto">
                     <a:xfrm>
                       <a:off x="0" y="0"/>
-                      <a:ext cx="3441700" cy="3100705"/>
+                      <a:ext cx="3051864" cy="2696400"/>
                     </a:xfrm>
                     <a:prstGeom prst="rect">
                       <a:avLst/>
                     </a:prstGeom>
-                    <a:noFill/>
                     <a:ln>
                       <a:noFill/>
                     </a:ln>
+                    <a:extLst>
+                      <a:ext uri="{53640926-AAD7-44D8-BBD7-CCE9431645EC}">
+                        <a14:shadowObscured xmlns:a14="http://schemas.microsoft.com/office/drawing/2010/main"/>
+                      </a:ext>
+                    </a:extLst>
                   </pic:spPr>
                 </pic:pic>
               </a:graphicData>
             </a:graphic>
-            <wp14:sizeRelH relativeFrom="margin">
+            <wp14:sizeRelH relativeFrom="page">
               <wp14:pctWidth>0</wp14:pctWidth>
             </wp14:sizeRelH>
-            <wp14:sizeRelV relativeFrom="margin">
+            <wp14:sizeRelV relativeFrom="page">
               <wp14:pctHeight>0</wp14:pctHeight>
             </wp14:sizeRelV>
           </wp:anchor>
@@ -2766,39 +2679,37 @@
           <w:noProof/>
         </w:rPr>
         <w:drawing>
-          <wp:anchor distT="0" distB="0" distL="114300" distR="114300" simplePos="0" relativeHeight="251661312" behindDoc="0" locked="0" layoutInCell="1" allowOverlap="1" wp14:anchorId="5595F85C" wp14:editId="673B2746">
+          <wp:anchor distT="0" distB="0" distL="114300" distR="114300" simplePos="0" relativeHeight="251667456" behindDoc="0" locked="0" layoutInCell="1" allowOverlap="1" wp14:anchorId="36723DB2" wp14:editId="7E79ABE0">
             <wp:simplePos x="0" y="0"/>
             <wp:positionH relativeFrom="column">
-              <wp:posOffset>3018155</wp:posOffset>
+              <wp:posOffset>-17780</wp:posOffset>
             </wp:positionH>
             <wp:positionV relativeFrom="paragraph">
-              <wp:posOffset>380641</wp:posOffset>
+              <wp:posOffset>302358</wp:posOffset>
             </wp:positionV>
-            <wp:extent cx="3402330" cy="3064510"/>
-            <wp:effectExtent l="0" t="0" r="7620" b="2540"/>
+            <wp:extent cx="3063600" cy="2696400"/>
+            <wp:effectExtent l="0" t="0" r="0" b="0"/>
             <wp:wrapTopAndBottom/>
-            <wp:docPr id="211917255" name="Picture 12"/>
+            <wp:docPr id="847357947" name="Picture 3"/>
             <wp:cNvGraphicFramePr>
-              <a:graphicFrameLocks xmlns:a="http://schemas.openxmlformats.org/drawingml/2006/main" noChangeAspect="1"/>
+              <a:graphicFrameLocks xmlns:a="http://schemas.openxmlformats.org/drawingml/2006/main"/>
             </wp:cNvGraphicFramePr>
             <a:graphic xmlns:a="http://schemas.openxmlformats.org/drawingml/2006/main">
               <a:graphicData uri="http://schemas.openxmlformats.org/drawingml/2006/picture">
                 <pic:pic xmlns:pic="http://schemas.openxmlformats.org/drawingml/2006/picture">
                   <pic:nvPicPr>
-                    <pic:cNvPr id="0" name="Picture 12"/>
-                    <pic:cNvPicPr>
-                      <a:picLocks noChangeAspect="1" noChangeArrowheads="1"/>
-                    </pic:cNvPicPr>
+                    <pic:cNvPr id="847357947" name="Picture 847357947"/>
+                    <pic:cNvPicPr/>
                   </pic:nvPicPr>
-                  <pic:blipFill>
-                    <a:blip r:embed="rId10">
+                  <pic:blipFill rotWithShape="1">
+                    <a:blip r:embed="rId10" cstate="print">
                       <a:extLst>
                         <a:ext uri="{28A0092B-C50C-407E-A947-70E740481C1C}">
                           <a14:useLocalDpi xmlns:a14="http://schemas.microsoft.com/office/drawing/2010/main" val="0"/>
                         </a:ext>
                       </a:extLst>
                     </a:blip>
-                    <a:srcRect/>
+                    <a:srcRect t="4791"/>
                     <a:stretch>
                       <a:fillRect/>
                     </a:stretch>
@@ -2806,27 +2717,68 @@
                   <pic:spPr bwMode="auto">
                     <a:xfrm>
                       <a:off x="0" y="0"/>
-                      <a:ext cx="3402330" cy="3064510"/>
+                      <a:ext cx="3063600" cy="2696400"/>
                     </a:xfrm>
                     <a:prstGeom prst="rect">
                       <a:avLst/>
                     </a:prstGeom>
-                    <a:noFill/>
                     <a:ln>
                       <a:noFill/>
                     </a:ln>
+                    <a:extLst>
+                      <a:ext uri="{53640926-AAD7-44D8-BBD7-CCE9431645EC}">
+                        <a14:shadowObscured xmlns:a14="http://schemas.microsoft.com/office/drawing/2010/main"/>
+                      </a:ext>
+                    </a:extLst>
                   </pic:spPr>
                 </pic:pic>
               </a:graphicData>
             </a:graphic>
-            <wp14:sizeRelH relativeFrom="margin">
+            <wp14:sizeRelH relativeFrom="page">
               <wp14:pctWidth>0</wp14:pctWidth>
             </wp14:sizeRelH>
-            <wp14:sizeRelV relativeFrom="margin">
+            <wp14:sizeRelV relativeFrom="page">
               <wp14:pctHeight>0</wp14:pctHeight>
             </wp14:sizeRelV>
           </wp:anchor>
         </w:drawing>
+      </w:r>
+    </w:p>
+    <w:p>
+      <w:pPr>
+        <w:pStyle w:val="titlufiguri"/>
+      </w:pPr>
+    </w:p>
+    <w:p>
+      <w:pPr>
+        <w:pStyle w:val="titlufiguri"/>
+        <w:ind w:left="4320" w:firstLine="720"/>
+        <w:jc w:val="both"/>
+      </w:pPr>
+      <w:r>
+        <w:t xml:space="preserve">Fig. 3. Productivitatea muncii – 2022 ( € / oră ) </w:t>
+      </w:r>
+      <w:r>
+        <w:tab/>
+      </w:r>
+      <w:r>
+        <w:tab/>
+        <w:t xml:space="preserve">          </w:t>
+      </w:r>
+    </w:p>
+    <w:p>
+      <w:pPr>
+        <w:pStyle w:val="titlufiguri"/>
+        <w:jc w:val="both"/>
+      </w:pPr>
+      <w:r>
+        <w:t xml:space="preserve">Fig. </w:t>
+      </w:r>
+      <w:r>
+        <w:t>4</w:t>
+      </w:r>
+      <w:r>
+        <w:t>. Productivitatea muncii – 2024 ( € / oră )</w:t>
       </w:r>
     </w:p>
     <w:p/>
@@ -2834,6 +2786,12 @@
     <w:p/>
     <w:p/>
     <w:p/>
+    <w:p/>
+    <w:p/>
+    <w:p/>
+    <w:p/>
+    <w:p/>
+    <w:p/>
     <w:p>
       <w:pPr>
         <w:rPr>
@@ -2875,6 +2833,7 @@
     </w:p>
     <w:p>
       <w:r>
+        <w:lastRenderedPageBreak/>
         <w:tab/>
         <w:t xml:space="preserve">C. </w:t>
       </w:r>
@@ -3040,7 +2999,21 @@
         <w:rPr>
           <w:rFonts w:eastAsia="Times New Roman" w:cs="Times New Roman"/>
         </w:rPr>
-        <w:t xml:space="preserve"> Labor </w:t>
+        <w:t xml:space="preserve"> </w:t>
+      </w:r>
+      <w:proofErr w:type="spellStart"/>
+      <w:r>
+        <w:rPr>
+          <w:rFonts w:eastAsia="Times New Roman" w:cs="Times New Roman"/>
+        </w:rPr>
+        <w:t>Labor</w:t>
+      </w:r>
+      <w:proofErr w:type="spellEnd"/>
+      <w:r>
+        <w:rPr>
+          <w:rFonts w:eastAsia="Times New Roman" w:cs="Times New Roman"/>
+        </w:rPr>
+        <w:t xml:space="preserve"> </w:t>
       </w:r>
       <w:proofErr w:type="spellStart"/>
       <w:r>
@@ -3288,7 +3261,21 @@
         <w:rPr>
           <w:rFonts w:eastAsia="Times New Roman" w:cs="Times New Roman"/>
         </w:rPr>
-        <w:t xml:space="preserve"> New York: National Bureau of Economic </w:t>
+        <w:t xml:space="preserve"> New York: National </w:t>
+      </w:r>
+      <w:proofErr w:type="spellStart"/>
+      <w:r>
+        <w:rPr>
+          <w:rFonts w:eastAsia="Times New Roman" w:cs="Times New Roman"/>
+        </w:rPr>
+        <w:t>Bureau</w:t>
+      </w:r>
+      <w:proofErr w:type="spellEnd"/>
+      <w:r>
+        <w:rPr>
+          <w:rFonts w:eastAsia="Times New Roman" w:cs="Times New Roman"/>
+        </w:rPr>
+        <w:t xml:space="preserve"> of Economic </w:t>
       </w:r>
       <w:proofErr w:type="spellStart"/>
       <w:r>
@@ -3852,33 +3839,11 @@
       </w:r>
     </w:p>
     <w:p>
-      <w:proofErr w:type="spellStart"/>
-      <w:r>
-        <w:rPr>
-          <w:rFonts w:eastAsia="Times New Roman" w:cs="Times New Roman"/>
-        </w:rPr>
-        <w:t>Caterino</w:t>
-      </w:r>
-      <w:proofErr w:type="spellEnd"/>
-      <w:r>
-        <w:rPr>
-          <w:rFonts w:eastAsia="Times New Roman" w:cs="Times New Roman"/>
-        </w:rPr>
-        <w:t xml:space="preserve">, M., </w:t>
-      </w:r>
-      <w:proofErr w:type="spellStart"/>
-      <w:r>
-        <w:rPr>
-          <w:rFonts w:eastAsia="Times New Roman" w:cs="Times New Roman"/>
-        </w:rPr>
-        <w:t>Cutolo</w:t>
-      </w:r>
-      <w:proofErr w:type="spellEnd"/>
-      <w:r>
-        <w:rPr>
-          <w:rFonts w:eastAsia="Times New Roman" w:cs="Times New Roman"/>
-        </w:rPr>
-        <w:t xml:space="preserve">, P., De Simone, V., Di </w:t>
+      <w:r>
+        <w:rPr>
+          <w:rFonts w:eastAsia="Times New Roman" w:cs="Times New Roman"/>
+        </w:rPr>
+        <w:t xml:space="preserve">Caterino, M., Cutolo, P., De Simone, V., Di </w:t>
       </w:r>
       <w:proofErr w:type="spellStart"/>
       <w:r>
@@ -4909,19 +4874,11 @@
       </w:r>
     </w:p>
     <w:p>
-      <w:proofErr w:type="spellStart"/>
-      <w:r>
-        <w:rPr>
-          <w:rFonts w:eastAsia="Times New Roman" w:cs="Times New Roman"/>
-        </w:rPr>
-        <w:t>Tirca</w:t>
-      </w:r>
-      <w:proofErr w:type="spellEnd"/>
-      <w:r>
-        <w:rPr>
-          <w:rFonts w:eastAsia="Times New Roman" w:cs="Times New Roman"/>
-        </w:rPr>
-        <w:t xml:space="preserve">, D.M. și Bujor, R., 2024. </w:t>
+      <w:r>
+        <w:rPr>
+          <w:rFonts w:eastAsia="Times New Roman" w:cs="Times New Roman"/>
+        </w:rPr>
+        <w:t xml:space="preserve">Tirca, D.M. și Bujor, R., 2024. </w:t>
       </w:r>
       <w:proofErr w:type="spellStart"/>
       <w:r>
@@ -5262,7 +5219,21 @@
         <w:rPr>
           <w:rFonts w:eastAsia="Times New Roman" w:cs="Times New Roman"/>
         </w:rPr>
-        <w:t xml:space="preserve"> Labor </w:t>
+        <w:t xml:space="preserve"> </w:t>
+      </w:r>
+      <w:proofErr w:type="spellStart"/>
+      <w:r>
+        <w:rPr>
+          <w:rFonts w:eastAsia="Times New Roman" w:cs="Times New Roman"/>
+        </w:rPr>
+        <w:t>Labor</w:t>
+      </w:r>
+      <w:proofErr w:type="spellEnd"/>
+      <w:r>
+        <w:rPr>
+          <w:rFonts w:eastAsia="Times New Roman" w:cs="Times New Roman"/>
+        </w:rPr>
+        <w:t xml:space="preserve"> </w:t>
       </w:r>
       <w:proofErr w:type="spellStart"/>
       <w:r>
@@ -5376,12 +5347,21 @@
       <w:r>
         <w:t xml:space="preserve">OECD (2025a) </w:t>
       </w:r>
-      <w:r>
-        <w:rPr>
-          <w:i/>
-          <w:iCs/>
-        </w:rPr>
-        <w:t xml:space="preserve">Labour </w:t>
+      <w:proofErr w:type="spellStart"/>
+      <w:r>
+        <w:rPr>
+          <w:i/>
+          <w:iCs/>
+        </w:rPr>
+        <w:t>Labour</w:t>
+      </w:r>
+      <w:proofErr w:type="spellEnd"/>
+      <w:r>
+        <w:rPr>
+          <w:i/>
+          <w:iCs/>
+        </w:rPr>
+        <w:t xml:space="preserve"> </w:t>
       </w:r>
       <w:proofErr w:type="spellStart"/>
       <w:r>
@@ -5621,15 +5601,53 @@
       </w:r>
     </w:p>
     <w:p>
-      <w:r>
-        <w:t xml:space="preserve">Statistics Finland (2025) </w:t>
-      </w:r>
-      <w:r>
-        <w:rPr>
-          <w:i/>
-          <w:iCs/>
-        </w:rPr>
-        <w:t xml:space="preserve">Labour Force Survey: </w:t>
+      <w:proofErr w:type="spellStart"/>
+      <w:r>
+        <w:t>Statistics</w:t>
+      </w:r>
+      <w:proofErr w:type="spellEnd"/>
+      <w:r>
+        <w:t xml:space="preserve"> </w:t>
+      </w:r>
+      <w:proofErr w:type="spellStart"/>
+      <w:r>
+        <w:t>Finland</w:t>
+      </w:r>
+      <w:proofErr w:type="spellEnd"/>
+      <w:r>
+        <w:t xml:space="preserve"> (2025) </w:t>
+      </w:r>
+      <w:proofErr w:type="spellStart"/>
+      <w:r>
+        <w:rPr>
+          <w:i/>
+          <w:iCs/>
+        </w:rPr>
+        <w:t>Labour</w:t>
+      </w:r>
+      <w:proofErr w:type="spellEnd"/>
+      <w:r>
+        <w:rPr>
+          <w:i/>
+          <w:iCs/>
+        </w:rPr>
+        <w:t xml:space="preserve"> Force </w:t>
+      </w:r>
+      <w:proofErr w:type="spellStart"/>
+      <w:r>
+        <w:rPr>
+          <w:i/>
+          <w:iCs/>
+        </w:rPr>
+        <w:t>Survey</w:t>
+      </w:r>
+      <w:proofErr w:type="spellEnd"/>
+      <w:r>
+        <w:rPr>
+          <w:i/>
+          <w:iCs/>
+        </w:rPr>
+        <w:t xml:space="preserve">: </w:t>
       </w:r>
       <w:proofErr w:type="spellStart"/>
       <w:r>
@@ -5673,7 +5691,31 @@
     </w:p>
     <w:p>
       <w:r>
-        <w:t xml:space="preserve">U.S. Bureau of Labor Statistics (2025) </w:t>
+        <w:t xml:space="preserve">U.S. </w:t>
+      </w:r>
+      <w:proofErr w:type="spellStart"/>
+      <w:r>
+        <w:t>Bureau</w:t>
+      </w:r>
+      <w:proofErr w:type="spellEnd"/>
+      <w:r>
+        <w:t xml:space="preserve"> of </w:t>
+      </w:r>
+      <w:proofErr w:type="spellStart"/>
+      <w:r>
+        <w:t>Labor</w:t>
+      </w:r>
+      <w:proofErr w:type="spellEnd"/>
+      <w:r>
+        <w:t xml:space="preserve"> </w:t>
+      </w:r>
+      <w:proofErr w:type="spellStart"/>
+      <w:r>
+        <w:t>Statistics</w:t>
+      </w:r>
+      <w:proofErr w:type="spellEnd"/>
+      <w:r>
+        <w:t xml:space="preserve"> (2025) </w:t>
       </w:r>
       <w:proofErr w:type="spellStart"/>
       <w:r>
@@ -10577,6 +10619,7 @@
   <w:style w:type="character" w:default="1" w:styleId="DefaultParagraphFont">
     <w:name w:val="Default Paragraph Font"/>
     <w:uiPriority w:val="1"/>
+    <w:semiHidden/>
     <w:unhideWhenUsed/>
   </w:style>
   <w:style w:type="table" w:default="1" w:styleId="TableNormal">
@@ -11130,6 +11173,20 @@
       <w:bCs/>
     </w:rPr>
   </w:style>
+  <w:style w:type="paragraph" w:customStyle="1" w:styleId="titlufiguri">
+    <w:name w:val="titlu_figuri"/>
+    <w:next w:val="Normal"/>
+    <w:qFormat/>
+    <w:rsid w:val="00A45984"/>
+    <w:pPr>
+      <w:jc w:val="center"/>
+    </w:pPr>
+    <w:rPr>
+      <w:rFonts w:ascii="Times New Roman" w:hAnsi="Times New Roman"/>
+      <w:sz w:val="20"/>
+      <w:lang w:val="ro-RO"/>
+    </w:rPr>
+  </w:style>
 </w:styles>
 </file>
 

</xml_diff>